<commit_message>
Update changelog with 2026-03-12 entry
- Append latest date to CHANGELOG_commit.md
</commit_message>
<xml_diff>
--- a/public/cv/christian_erben_cv_de.docx
+++ b/public/cv/christian_erben_cv_de.docx
@@ -53,7 +53,7 @@
                           </pic:cNvPicPr>
                         </pic:nvPicPr>
                         <pic:blipFill>
-                          <a:blip r:embed="rId7" cstate="none"/>
+                          <a:blip r:embed="rId8" cstate="none"/>
                           <a:srcRect/>
                           <a:stretch>
                             <a:fillRect/>
@@ -2807,7 +2807,7 @@
       </w:tr>
     </w:tbl>
     <w:sectPr>
-      <w:footerReference w:type="default" r:id="rId6"/>
+      <w:footerReference w:type="default" r:id="rId7"/>
       <w:pgSz w:w="11906" w:h="16838" w:orient="portrait"/>
       <w:pgMar w:top="720" w:right="720" w:bottom="720" w:left="720" w:header="708" w:footer="708" w:gutter="0"/>
       <w:pgNumType/>
@@ -2819,6 +2819,43 @@
 
 <file path=word/comments.xml><?xml version="1.0" encoding="utf-8"?>
 <w:comments xmlns:cx="http://schemas.microsoft.com/office/drawing/2014/chartex" xmlns:cx1="http://schemas.microsoft.com/office/drawing/2015/9/8/chartex" xmlns:cx2="http://schemas.microsoft.com/office/drawing/2015/10/21/chartex" xmlns:cx3="http://schemas.microsoft.com/office/drawing/2016/5/9/chartex" xmlns:cx4="http://schemas.microsoft.com/office/drawing/2016/5/10/chartex" xmlns:cx5="http://schemas.microsoft.com/office/drawing/2016/5/11/chartex" xmlns:cx6="http://schemas.microsoft.com/office/drawing/2016/5/12/chartex" xmlns:cx7="http://schemas.microsoft.com/office/drawing/2016/5/13/chartex" xmlns:cx8="http://schemas.microsoft.com/office/drawing/2016/5/14/chartex" xmlns:mc="http://schemas.openxmlformats.org/markup-compatibility/2006" xmlns:aink="http://schemas.microsoft.com/office/drawing/2016/ink" xmlns:am3d="http://schemas.microsoft.com/office/drawing/2017/model3d" xmlns:o="urn:schemas-microsoft-com:office:office" xmlns:r="http://schemas.openxmlformats.org/officeDocument/2006/relationships" xmlns:m="http://schemas.openxmlformats.org/officeDocument/2006/math" xmlns:v="urn:schemas-microsoft-com:vml" xmlns:wp14="http://schemas.microsoft.com/office/word/2010/wordprocessingDrawing" xmlns:wp="http://schemas.openxmlformats.org/drawingml/2006/wordprocessingDrawing" xmlns:w10="urn:schemas-microsoft-com:office:word" xmlns:w="http://schemas.openxmlformats.org/wordprocessingml/2006/main" xmlns:w14="http://schemas.microsoft.com/office/word/2010/wordml" xmlns:w15="http://schemas.microsoft.com/office/word/2012/wordml" xmlns:w16cex="http://schemas.microsoft.com/office/word/2018/wordml/cex" xmlns:w16cid="http://schemas.microsoft.com/office/word/2016/wordml/cid" xmlns:w16="http://schemas.microsoft.com/office/word/2018/wordml" xmlns:w16sdtdh="http://schemas.microsoft.com/office/word/2020/wordml/sdtdatahash" xmlns:w16se="http://schemas.microsoft.com/office/word/2015/wordml/symex" xmlns:wpg="http://schemas.microsoft.com/office/word/2010/wordprocessingGroup" xmlns:wpi="http://schemas.microsoft.com/office/word/2010/wordprocessingInk" xmlns:wne="http://schemas.microsoft.com/office/word/2006/wordml" xmlns:wps="http://schemas.microsoft.com/office/word/2010/wordprocessingShape"/>
+</file>
+
+<file path=word/endnotes.xml><?xml version="1.0" encoding="utf-8"?>
+<w:endnotes xmlns:wpc="http://schemas.microsoft.com/office/word/2010/wordprocessingCanvas" xmlns:mc="http://schemas.openxmlformats.org/markup-compatibility/2006" xmlns:o="urn:schemas-microsoft-com:office:office" xmlns:r="http://schemas.openxmlformats.org/officeDocument/2006/relationships" xmlns:m="http://schemas.openxmlformats.org/officeDocument/2006/math" xmlns:v="urn:schemas-microsoft-com:vml" xmlns:wp14="http://schemas.microsoft.com/office/word/2010/wordprocessingDrawing" xmlns:wp="http://schemas.openxmlformats.org/drawingml/2006/wordprocessingDrawing" xmlns:w10="urn:schemas-microsoft-com:office:word" xmlns:w="http://schemas.openxmlformats.org/wordprocessingml/2006/main" xmlns:w14="http://schemas.microsoft.com/office/word/2010/wordml" xmlns:w15="http://schemas.microsoft.com/office/word/2012/wordml" xmlns:wpg="http://schemas.microsoft.com/office/word/2010/wordprocessingGroup" xmlns:wpi="http://schemas.microsoft.com/office/word/2010/wordprocessingInk" xmlns:wne="http://schemas.microsoft.com/office/word/2006/wordml" xmlns:wps="http://schemas.microsoft.com/office/word/2010/wordprocessingShape" mc:Ignorable="w14 w15 wp14">
+  <w:endnote w:type="separator" w:id="-1">
+    <w:p>
+      <w:pPr>
+        <w:spacing w:after="0" w:line="240" w:lineRule="auto"/>
+      </w:pPr>
+      <w:r>
+        <w:rPr>
+          <w:rStyle w:val="EndnoteReference"/>
+        </w:rPr>
+        <w:endnoteRef/>
+      </w:r>
+      <w:r>
+        <w:separator/>
+      </w:r>
+    </w:p>
+  </w:endnote>
+  <w:endnote w:type="continuationSeparator" w:id="0">
+    <w:p>
+      <w:pPr>
+        <w:spacing w:after="0" w:line="240" w:lineRule="auto"/>
+      </w:pPr>
+      <w:r>
+        <w:rPr>
+          <w:rStyle w:val="EndnoteReference"/>
+        </w:rPr>
+        <w:endnoteRef/>
+      </w:r>
+      <w:r>
+        <w:continuationSeparator/>
+      </w:r>
+    </w:p>
+  </w:endnote>
+</w:endnotes>
 </file>
 
 <file path=word/footer1.xml><?xml version="1.0" encoding="utf-8"?>
@@ -3155,6 +3192,43 @@
       <w:szCs w:val="20"/>
     </w:rPr>
   </w:style>
+  <w:style w:type="character" w:styleId="EndnoteReference">
+    <w:name w:val="endnote reference"/>
+    <w:basedOn w:val="DefaultParagraphFont"/>
+    <w:uiPriority w:val="99"/>
+    <w:semiHidden/>
+    <w:unhideWhenUsed/>
+    <w:rPr>
+      <w:vertAlign w:val="superscript"/>
+    </w:rPr>
+  </w:style>
+  <w:style w:type="paragraph" w:styleId="EndnoteText">
+    <w:name w:val="endnote text"/>
+    <w:basedOn w:val="Normal"/>
+    <w:link w:val="EndnoteTextChar"/>
+    <w:uiPriority w:val="99"/>
+    <w:semiHidden/>
+    <w:unhideWhenUsed/>
+    <w:pPr>
+      <w:spacing w:after="0" w:line="240" w:lineRule="auto"/>
+    </w:pPr>
+    <w:rPr>
+      <w:sz w:val="20"/>
+      <w:szCs w:val="20"/>
+    </w:rPr>
+  </w:style>
+  <w:style w:type="character" w:styleId="EndnoteTextChar">
+    <w:name w:val="Endnote Text Char"/>
+    <w:basedOn w:val="DefaultParagraphFont"/>
+    <w:link w:val="EndnoteText"/>
+    <w:uiPriority w:val="99"/>
+    <w:semiHidden/>
+    <w:unhideWhenUsed/>
+    <w:rPr>
+      <w:sz w:val="20"/>
+      <w:szCs w:val="20"/>
+    </w:rPr>
+  </w:style>
   <w:style w:type="paragraph" w:styleId="Normal">
     <w:name w:val="Normal"/>
     <w:rPr>

</xml_diff>

<commit_message>
Update availability and current project
</commit_message>
<xml_diff>
--- a/public/cv/christian_erben_cv_de.docx
+++ b/public/cv/christian_erben_cv_de.docx
@@ -701,7 +701,7 @@
                 <w:sz w:val="20"/>
                 <w:szCs w:val="20"/>
               </w:rPr>
-              <w:t xml:space="preserve">Netzwerkadministrator (Palo Alto / Fortinet)</w:t>
+              <w:t xml:space="preserve">Middleware- &amp; IPv6-Migrationsexperte</w:t>
             </w:r>
           </w:p>
           <w:p>
@@ -713,7 +713,7 @@
                 <w:sz w:val="18"/>
                 <w:szCs w:val="18"/>
               </w:rPr>
-              <w:t xml:space="preserve">St. Dominikus Krankenhaus und Jugendhilfe gGmbH</w:t>
+              <w:t xml:space="preserve">Confidential Client</w:t>
             </w:r>
             <w:r>
               <w:rPr>
@@ -721,7 +721,7 @@
                 <w:sz w:val="18"/>
                 <w:szCs w:val="18"/>
               </w:rPr>
-              <w:t xml:space="preserve"> — Feb 2026 - Heute</w:t>
+              <w:t xml:space="preserve"> — Mai 2026 - Heute</w:t>
             </w:r>
           </w:p>
           <w:p>
@@ -734,121 +734,102 @@
                 <w:sz w:val="18"/>
                 <w:szCs w:val="18"/>
               </w:rPr>
-              <w:t xml:space="preserve">Ludwigshafen, Deutschland</w:t>
-            </w:r>
-          </w:p>
-          <w:p>
-            <w:pPr>
-              <w:pStyle w:val="ListParagraph"/>
-              <w:numPr>
-                <w:ilvl w:val="0"/>
-                <w:numId w:val="1"/>
-              </w:numPr>
-            </w:pPr>
-            <w:r>
-              <w:rPr>
-                <w:b w:val="false"/>
-                <w:bCs w:val="false"/>
-                <w:color w:val="07090B"/>
-                <w:sz w:val="18"/>
-                <w:szCs w:val="18"/>
-              </w:rPr>
-              <w:t xml:space="preserve">Verantwortlich für die Hochverfügbarkeit und den sicheren Betrieb von LAN-, WLAN- und VPN-Services in medizinischen und administrativen Umgebungen.</w:t>
-            </w:r>
-          </w:p>
-          <w:p>
-            <w:pPr>
-              <w:pStyle w:val="ListParagraph"/>
-              <w:numPr>
-                <w:ilvl w:val="0"/>
-                <w:numId w:val="1"/>
-              </w:numPr>
-            </w:pPr>
-            <w:r>
-              <w:rPr>
-                <w:b w:val="false"/>
-                <w:bCs w:val="false"/>
-                <w:color w:val="07090B"/>
-                <w:sz w:val="18"/>
-                <w:szCs w:val="18"/>
-              </w:rPr>
-              <w:t xml:space="preserve">Betrieb und Pflege der Netzwerkinfrastruktur inkl. Switches, Routern, Firewalls und VLAN-Segmentierung für unterschiedliche Krankenhausbereiche.</w:t>
-            </w:r>
-          </w:p>
-          <w:p>
-            <w:pPr>
-              <w:pStyle w:val="ListParagraph"/>
-              <w:numPr>
-                <w:ilvl w:val="0"/>
-                <w:numId w:val="1"/>
-              </w:numPr>
-            </w:pPr>
-            <w:r>
-              <w:rPr>
-                <w:b w:val="false"/>
-                <w:bCs w:val="false"/>
-                <w:color w:val="07090B"/>
-                <w:sz w:val="18"/>
-                <w:szCs w:val="18"/>
-              </w:rPr>
-              <w:t xml:space="preserve">Umsetzung von Sicherheitskontrollen und Richtlinien gemäß ISO 27001, BSI-Grundschutz, DSGVO und sektorspezifischen Anforderungen.</w:t>
-            </w:r>
-          </w:p>
-          <w:p>
-            <w:pPr>
-              <w:pStyle w:val="ListParagraph"/>
-              <w:numPr>
-                <w:ilvl w:val="0"/>
-                <w:numId w:val="1"/>
-              </w:numPr>
-            </w:pPr>
-            <w:r>
-              <w:rPr>
-                <w:b w:val="false"/>
-                <w:bCs w:val="false"/>
-                <w:color w:val="07090B"/>
-                <w:sz w:val="18"/>
-                <w:szCs w:val="18"/>
-              </w:rPr>
-              <w:t xml:space="preserve">Monitoring von Netzwerkperformance und Ausfallsicherheit kritischer Systeme sowie schnelle Störungsbehebung in Incident-Szenarien.</w:t>
-            </w:r>
-          </w:p>
-          <w:p>
-            <w:pPr>
-              <w:pStyle w:val="ListParagraph"/>
-              <w:numPr>
-                <w:ilvl w:val="0"/>
-                <w:numId w:val="1"/>
-              </w:numPr>
-            </w:pPr>
-            <w:r>
-              <w:rPr>
-                <w:b w:val="false"/>
-                <w:bCs w:val="false"/>
-                <w:color w:val="07090B"/>
-                <w:sz w:val="18"/>
-                <w:szCs w:val="18"/>
-              </w:rPr>
-              <w:t xml:space="preserve">Integration medizinischer Geräte in die Krankenhausnetzwerke und Sicherstellung einer sicheren Interoperabilität mit klinischen Informationssystemen.</w:t>
-            </w:r>
-          </w:p>
-          <w:p>
-            <w:pPr>
-              <w:pStyle w:val="ListParagraph"/>
-              <w:numPr>
-                <w:ilvl w:val="0"/>
-                <w:numId w:val="1"/>
-              </w:numPr>
-            </w:pPr>
-            <w:r>
-              <w:rPr>
-                <w:b/>
-                <w:bCs/>
-                <w:color w:val="1B6E5A"/>
-                <w:sz w:val="18"/>
-                <w:szCs w:val="18"/>
-              </w:rPr>
-              <w:t xml:space="preserve">Erfolg: Derzeitige Migration IPSec-VPN-Tunnel von Cisco auf Palo Alto mit stufenweiser Umschaltplanung und ohne Betriebsunterbrechung.</w:t>
+              <w:t xml:space="preserve">Remote / Deutschland</w:t>
+            </w:r>
+          </w:p>
+          <w:p>
+            <w:pPr>
+              <w:pStyle w:val="ListParagraph"/>
+              <w:numPr>
+                <w:ilvl w:val="0"/>
+                <w:numId w:val="1"/>
+              </w:numPr>
+            </w:pPr>
+            <w:r>
+              <w:rPr>
+                <w:b w:val="false"/>
+                <w:bCs w:val="false"/>
+                <w:color w:val="07090B"/>
+                <w:sz w:val="18"/>
+                <w:szCs w:val="18"/>
+              </w:rPr>
+              <w:t xml:space="preserve">Technische Begleitung der Migration von Fachverfahren aus IPv4-Umgebungen in einen IPv6-fähigen Dual-Stack-Betrieb.</w:t>
+            </w:r>
+          </w:p>
+          <w:p>
+            <w:pPr>
+              <w:pStyle w:val="ListParagraph"/>
+              <w:numPr>
+                <w:ilvl w:val="0"/>
+                <w:numId w:val="1"/>
+              </w:numPr>
+            </w:pPr>
+            <w:r>
+              <w:rPr>
+                <w:b w:val="false"/>
+                <w:bCs w:val="false"/>
+                <w:color w:val="07090B"/>
+                <w:sz w:val="18"/>
+                <w:szCs w:val="18"/>
+              </w:rPr>
+              <w:t xml:space="preserve">Analyse von Anwendungsabhängigkeiten, Middleware-Komponenten, Datenbankanbindungen und betrieblichen Rahmenbedingungen zur Bewertung der Migrationsbereitschaft.</w:t>
+            </w:r>
+          </w:p>
+          <w:p>
+            <w:pPr>
+              <w:pStyle w:val="ListParagraph"/>
+              <w:numPr>
+                <w:ilvl w:val="0"/>
+                <w:numId w:val="1"/>
+              </w:numPr>
+            </w:pPr>
+            <w:r>
+              <w:rPr>
+                <w:b w:val="false"/>
+                <w:bCs w:val="false"/>
+                <w:color w:val="07090B"/>
+                <w:sz w:val="18"/>
+                <w:szCs w:val="18"/>
+              </w:rPr>
+              <w:t xml:space="preserve">Entwicklung von Migrationsplänen für einzelne und geclusterte Fachverfahren in enger Abstimmung mit Fachverfahrensverantwortlichen, IT-Betrieb und Qualitätssicherung.</w:t>
+            </w:r>
+          </w:p>
+          <w:p>
+            <w:pPr>
+              <w:pStyle w:val="ListParagraph"/>
+              <w:numPr>
+                <w:ilvl w:val="0"/>
+                <w:numId w:val="1"/>
+              </w:numPr>
+            </w:pPr>
+            <w:r>
+              <w:rPr>
+                <w:b w:val="false"/>
+                <w:bCs w:val="false"/>
+                <w:color w:val="07090B"/>
+                <w:sz w:val="18"/>
+                <w:szCs w:val="18"/>
+              </w:rPr>
+              <w:t xml:space="preserve">Validierung von Dual-Stack-Fähigkeit, IPv6-Funktionalität, Sicherheitsanforderungen und Dokumentationsqualität für eine verlässliche Migrationsdurchführung.</w:t>
+            </w:r>
+          </w:p>
+          <w:p>
+            <w:pPr>
+              <w:pStyle w:val="ListParagraph"/>
+              <w:numPr>
+                <w:ilvl w:val="0"/>
+                <w:numId w:val="1"/>
+              </w:numPr>
+            </w:pPr>
+            <w:r>
+              <w:rPr>
+                <w:b/>
+                <w:bCs/>
+                <w:color w:val="1B6E5A"/>
+                <w:sz w:val="18"/>
+                <w:szCs w:val="18"/>
+              </w:rPr>
+              <w:t xml:space="preserve">Erfolg: Unterstützung einer groß angelegten IPv6-Transition über mehrere Fachverfahren hinweg mit strukturierten Readiness-Assessments, Migrationsdokumentation und Stakeholder-Kommunikation.</w:t>
             </w:r>
           </w:p>
           <w:p/>
@@ -1179,6 +1160,165 @@
                 <w:szCs w:val="18"/>
               </w:rPr>
               <w:t xml:space="preserve">Erfolg: Einführung von Microsoft-Azure-Diensten in die Infrastruktur bei gleichzeitiger Sicherstellung compliantem hybriden Betrieb.</w:t>
+            </w:r>
+          </w:p>
+          <w:p/>
+          <w:p>
+            <w:r>
+              <w:rPr>
+                <w:b/>
+                <w:bCs/>
+                <w:sz w:val="20"/>
+                <w:szCs w:val="20"/>
+              </w:rPr>
+              <w:t xml:space="preserve">Netzwerkadministrator (Palo Alto / Fortinet)</w:t>
+            </w:r>
+          </w:p>
+          <w:p>
+            <w:r>
+              <w:rPr>
+                <w:i/>
+                <w:iCs/>
+                <w:color w:val="1B6E5A"/>
+                <w:sz w:val="18"/>
+                <w:szCs w:val="18"/>
+              </w:rPr>
+              <w:t xml:space="preserve">St. Dominikus Krankenhaus und Jugendhilfe gGmbH</w:t>
+            </w:r>
+            <w:r>
+              <w:rPr>
+                <w:color w:val="3A2366"/>
+                <w:sz w:val="18"/>
+                <w:szCs w:val="18"/>
+              </w:rPr>
+              <w:t xml:space="preserve"> — Februar 2026 - April 2026</w:t>
+            </w:r>
+          </w:p>
+          <w:p>
+            <w:pPr>
+              <w:spacing w:after="100"/>
+            </w:pPr>
+            <w:r>
+              <w:rPr>
+                <w:color w:val="3A2366"/>
+                <w:sz w:val="18"/>
+                <w:szCs w:val="18"/>
+              </w:rPr>
+              <w:t xml:space="preserve">Ludwigshafen, Deutschland</w:t>
+            </w:r>
+          </w:p>
+          <w:p>
+            <w:pPr>
+              <w:pStyle w:val="ListParagraph"/>
+              <w:numPr>
+                <w:ilvl w:val="0"/>
+                <w:numId w:val="1"/>
+              </w:numPr>
+            </w:pPr>
+            <w:r>
+              <w:rPr>
+                <w:b w:val="false"/>
+                <w:bCs w:val="false"/>
+                <w:color w:val="07090B"/>
+                <w:sz w:val="18"/>
+                <w:szCs w:val="18"/>
+              </w:rPr>
+              <w:t xml:space="preserve">Verantwortlich für die Hochverfügbarkeit und den sicheren Betrieb von LAN-, WLAN- und VPN-Services in medizinischen und administrativen Umgebungen.</w:t>
+            </w:r>
+          </w:p>
+          <w:p>
+            <w:pPr>
+              <w:pStyle w:val="ListParagraph"/>
+              <w:numPr>
+                <w:ilvl w:val="0"/>
+                <w:numId w:val="1"/>
+              </w:numPr>
+            </w:pPr>
+            <w:r>
+              <w:rPr>
+                <w:b w:val="false"/>
+                <w:bCs w:val="false"/>
+                <w:color w:val="07090B"/>
+                <w:sz w:val="18"/>
+                <w:szCs w:val="18"/>
+              </w:rPr>
+              <w:t xml:space="preserve">Betrieb und Pflege der Netzwerkinfrastruktur inkl. Switches, Routern, Firewalls und VLAN-Segmentierung für unterschiedliche Krankenhausbereiche.</w:t>
+            </w:r>
+          </w:p>
+          <w:p>
+            <w:pPr>
+              <w:pStyle w:val="ListParagraph"/>
+              <w:numPr>
+                <w:ilvl w:val="0"/>
+                <w:numId w:val="1"/>
+              </w:numPr>
+            </w:pPr>
+            <w:r>
+              <w:rPr>
+                <w:b w:val="false"/>
+                <w:bCs w:val="false"/>
+                <w:color w:val="07090B"/>
+                <w:sz w:val="18"/>
+                <w:szCs w:val="18"/>
+              </w:rPr>
+              <w:t xml:space="preserve">Umsetzung von Sicherheitskontrollen und Richtlinien gemäß ISO 27001, BSI-Grundschutz, DSGVO und sektorspezifischen Anforderungen.</w:t>
+            </w:r>
+          </w:p>
+          <w:p>
+            <w:pPr>
+              <w:pStyle w:val="ListParagraph"/>
+              <w:numPr>
+                <w:ilvl w:val="0"/>
+                <w:numId w:val="1"/>
+              </w:numPr>
+            </w:pPr>
+            <w:r>
+              <w:rPr>
+                <w:b w:val="false"/>
+                <w:bCs w:val="false"/>
+                <w:color w:val="07090B"/>
+                <w:sz w:val="18"/>
+                <w:szCs w:val="18"/>
+              </w:rPr>
+              <w:t xml:space="preserve">Monitoring von Netzwerkperformance und Ausfallsicherheit kritischer Systeme sowie schnelle Störungsbehebung in Incident-Szenarien.</w:t>
+            </w:r>
+          </w:p>
+          <w:p>
+            <w:pPr>
+              <w:pStyle w:val="ListParagraph"/>
+              <w:numPr>
+                <w:ilvl w:val="0"/>
+                <w:numId w:val="1"/>
+              </w:numPr>
+            </w:pPr>
+            <w:r>
+              <w:rPr>
+                <w:b w:val="false"/>
+                <w:bCs w:val="false"/>
+                <w:color w:val="07090B"/>
+                <w:sz w:val="18"/>
+                <w:szCs w:val="18"/>
+              </w:rPr>
+              <w:t xml:space="preserve">Integration medizinischer Geräte in die Krankenhausnetzwerke und Sicherstellung einer sicheren Interoperabilität mit klinischen Informationssystemen.</w:t>
+            </w:r>
+          </w:p>
+          <w:p>
+            <w:pPr>
+              <w:pStyle w:val="ListParagraph"/>
+              <w:numPr>
+                <w:ilvl w:val="0"/>
+                <w:numId w:val="1"/>
+              </w:numPr>
+            </w:pPr>
+            <w:r>
+              <w:rPr>
+                <w:b/>
+                <w:bCs/>
+                <w:color w:val="1B6E5A"/>
+                <w:sz w:val="18"/>
+                <w:szCs w:val="18"/>
+              </w:rPr>
+              <w:t xml:space="preserve">Erfolg: Derzeitige Migration IPSec-VPN-Tunnel von Cisco auf Palo Alto mit stufenweiser Umschaltplanung und ohne Betriebsunterbrechung.</w:t>
             </w:r>
           </w:p>
           <w:p/>

</xml_diff>

<commit_message>
Generalize IPv6 consulting experience in CV
</commit_message>
<xml_diff>
--- a/public/cv/christian_erben_cv_de.docx
+++ b/public/cv/christian_erben_cv_de.docx
@@ -701,7 +701,7 @@
                 <w:sz w:val="20"/>
                 <w:szCs w:val="20"/>
               </w:rPr>
-              <w:t xml:space="preserve">Middleware- &amp; IPv6-Migrationsexperte</w:t>
+              <w:t xml:space="preserve">IT-Berater mit Schwerpunkt IPv6</w:t>
             </w:r>
           </w:p>
           <w:p>
@@ -713,7 +713,7 @@
                 <w:sz w:val="18"/>
                 <w:szCs w:val="18"/>
               </w:rPr>
-              <w:t xml:space="preserve">Confidential Client</w:t>
+              <w:t xml:space="preserve">öffentlicher Auftraggeber / Public-sector client</w:t>
             </w:r>
             <w:r>
               <w:rPr>
@@ -753,83 +753,64 @@
                 <w:sz w:val="18"/>
                 <w:szCs w:val="18"/>
               </w:rPr>
-              <w:t xml:space="preserve">Technische Begleitung der Migration von Fachverfahren aus IPv4-Umgebungen in einen IPv6-fähigen Dual-Stack-Betrieb.</w:t>
-            </w:r>
-          </w:p>
-          <w:p>
-            <w:pPr>
-              <w:pStyle w:val="ListParagraph"/>
-              <w:numPr>
-                <w:ilvl w:val="0"/>
-                <w:numId w:val="1"/>
-              </w:numPr>
-            </w:pPr>
-            <w:r>
-              <w:rPr>
-                <w:b w:val="false"/>
-                <w:bCs w:val="false"/>
-                <w:color w:val="07090B"/>
-                <w:sz w:val="18"/>
-                <w:szCs w:val="18"/>
-              </w:rPr>
-              <w:t xml:space="preserve">Analyse von Anwendungsabhängigkeiten, Middleware-Komponenten, Datenbankanbindungen und betrieblichen Rahmenbedingungen zur Bewertung der Migrationsbereitschaft.</w:t>
-            </w:r>
-          </w:p>
-          <w:p>
-            <w:pPr>
-              <w:pStyle w:val="ListParagraph"/>
-              <w:numPr>
-                <w:ilvl w:val="0"/>
-                <w:numId w:val="1"/>
-              </w:numPr>
-            </w:pPr>
-            <w:r>
-              <w:rPr>
-                <w:b w:val="false"/>
-                <w:bCs w:val="false"/>
-                <w:color w:val="07090B"/>
-                <w:sz w:val="18"/>
-                <w:szCs w:val="18"/>
-              </w:rPr>
-              <w:t xml:space="preserve">Entwicklung von Migrationsplänen für einzelne und geclusterte Fachverfahren in enger Abstimmung mit Fachverfahrensverantwortlichen, IT-Betrieb und Qualitätssicherung.</w:t>
-            </w:r>
-          </w:p>
-          <w:p>
-            <w:pPr>
-              <w:pStyle w:val="ListParagraph"/>
-              <w:numPr>
-                <w:ilvl w:val="0"/>
-                <w:numId w:val="1"/>
-              </w:numPr>
-            </w:pPr>
-            <w:r>
-              <w:rPr>
-                <w:b w:val="false"/>
-                <w:bCs w:val="false"/>
-                <w:color w:val="07090B"/>
-                <w:sz w:val="18"/>
-                <w:szCs w:val="18"/>
-              </w:rPr>
-              <w:t xml:space="preserve">Validierung von Dual-Stack-Fähigkeit, IPv6-Funktionalität, Sicherheitsanforderungen und Dokumentationsqualität für eine verlässliche Migrationsdurchführung.</w:t>
-            </w:r>
-          </w:p>
-          <w:p>
-            <w:pPr>
-              <w:pStyle w:val="ListParagraph"/>
-              <w:numPr>
-                <w:ilvl w:val="0"/>
-                <w:numId w:val="1"/>
-              </w:numPr>
-            </w:pPr>
-            <w:r>
-              <w:rPr>
-                <w:b/>
-                <w:bCs/>
-                <w:color w:val="1B6E5A"/>
-                <w:sz w:val="18"/>
-                <w:szCs w:val="18"/>
-              </w:rPr>
-              <w:t xml:space="preserve">Erfolg: Unterstützung einer groß angelegten IPv6-Transition über mehrere Fachverfahren hinweg mit strukturierten Readiness-Assessments, Migrationsdokumentation und Stakeholder-Kommunikation.</w:t>
+              <w:t xml:space="preserve">Technische Beratung zur IPv6-Fähigkeit von IT-Systemen und Anwendungen.</w:t>
+            </w:r>
+          </w:p>
+          <w:p>
+            <w:pPr>
+              <w:pStyle w:val="ListParagraph"/>
+              <w:numPr>
+                <w:ilvl w:val="0"/>
+                <w:numId w:val="1"/>
+              </w:numPr>
+            </w:pPr>
+            <w:r>
+              <w:rPr>
+                <w:b w:val="false"/>
+                <w:bCs w:val="false"/>
+                <w:color w:val="07090B"/>
+                <w:sz w:val="18"/>
+                <w:szCs w:val="18"/>
+              </w:rPr>
+              <w:t xml:space="preserve">Bewertung technischer Voraussetzungen und Unterstützung bei der Planung von Anpassungen.</w:t>
+            </w:r>
+          </w:p>
+          <w:p>
+            <w:pPr>
+              <w:pStyle w:val="ListParagraph"/>
+              <w:numPr>
+                <w:ilvl w:val="0"/>
+                <w:numId w:val="1"/>
+              </w:numPr>
+            </w:pPr>
+            <w:r>
+              <w:rPr>
+                <w:b w:val="false"/>
+                <w:bCs w:val="false"/>
+                <w:color w:val="07090B"/>
+                <w:sz w:val="18"/>
+                <w:szCs w:val="18"/>
+              </w:rPr>
+              <w:t xml:space="preserve">Begleitung technischer Tests und Dokumentation der Ergebnisse.</w:t>
+            </w:r>
+          </w:p>
+          <w:p>
+            <w:pPr>
+              <w:pStyle w:val="ListParagraph"/>
+              <w:numPr>
+                <w:ilvl w:val="0"/>
+                <w:numId w:val="1"/>
+              </w:numPr>
+            </w:pPr>
+            <w:r>
+              <w:rPr>
+                <w:b w:val="false"/>
+                <w:bCs w:val="false"/>
+                <w:color w:val="07090B"/>
+                <w:sz w:val="18"/>
+                <w:szCs w:val="18"/>
+              </w:rPr>
+              <w:t xml:space="preserve">Abstimmung technischer Fragestellungen mit beteiligten Teams.</w:t>
             </w:r>
           </w:p>
           <w:p/>

</xml_diff>